<commit_message>
docs(guide): add step-by-step 'sending a partner-only note' how-to (v2.13)
Add a numbered agent procedure (How an agent sends a partner-only note) to the
member-facing Implementation Guide, naming the 'TSANet: Send partner-only note'
macro and the native-composer constraint. Also correct the stale ZAF note text
in the body (Public/Internal -> Internal/Partner only/Public, v1.0.41 -> v1.0.43).

Co-Authored-By: Claude Opus 4.8 <noreply@anthropic.com>
</commit_message>
<xml_diff>
--- a/Zendesk_PlainLanguage_Implementation_Guide_v2.13.docx
+++ b/Zendesk_PlainLanguage_Implementation_Guide_v2.13.docx
@@ -13252,7 +13252,7 @@
           <w:sz w:val="20"/>
           <w:szCs w:val="20"/>
         </w:rPr>
-        <w:t xml:space="preserve">Action buttons: New Collaboration, Accept, Reject, Request More Info, Respond Now, Add Note (Subject + Details, with a Public / Internal choice), Close</w:t>
+        <w:t xml:space="preserve">Action buttons: New Collaboration, Accept, Reject, Request More Info, Respond Now, Add Note (Subject + Details, with an Internal / Partner only / Public choice), Close</w:t>
       </w:r>
     </w:p>
     <w:p xmlns:wp14="http://schemas.microsoft.com/office/word/2010/wordml" wp14:textId="77777777">
@@ -13312,7 +13312,114 @@
           <w:szCs w:val="19"/>
           <w:lang w:val="en-US"/>
         </w:rPr>
-        <w:t>Current version: v1.0.41 (June 2026). The app is distributed as a pre-built ZIP — every tagged release automatically packages the ZIP and attaches it to a GitHub Release, and members install directly via Admin Center without needing to build from source. v1.0.41 adds a Public / Internal choice when adding a note (Public notes are sent to the partner and are visible to the end customer; Internal notes stay in Zendesk only), forwards public agent replies to the partner automatically, and delivers each forwarded note exactly once. The install dialog ships with empty Field ID defaults so each member must enter their own custom field IDs.</w:t>
+        <w:t>Current version: v1.0.43 (June 2026). The app is distributed as a pre-built ZIP — every tagged release automatically packages the ZIP and attaches it to a GitHub Release, and members install directly via Admin Center without needing to build from source. When adding a note, agents choose Internal, Partner only, or Public: Internal stays in Zendesk, Partner only is sent to the partner but hidden from the end customer, and Public is sent to the partner and visible to the end customer. Public agent replies are forwarded to the partner automatically and each forwarded note is delivered exactly once. The install dialog ships with empty Field ID defaults so each member must enter their own custom field IDs.</w:t>
+      </w:r>
+    </w:p>
+    <w:p xmlns:wp14="http://schemas.microsoft.com/office/word/2010/wordml" wp14:textId="77777777">
+      <w:pPr>
+        <w:spacing w:before="200" w:after="120"/>
+        <w:jc w:val="left"/>
+      </w:pPr>
+      <w:r>
+        <w:rPr>
+          <w:rFonts w:ascii="Arial" w:hAnsi="Arial" w:eastAsia="Arial" w:cs="Arial"/>
+          <w:b w:val="1"/>
+          <w:bCs w:val="1"/>
+          <w:color w:val="1A1A2E"/>
+          <w:sz w:val="21"/>
+          <w:szCs w:val="21"/>
+        </w:rPr>
+        <w:t>How an agent sends a partner-only note (hidden from the end customer)</w:t>
+      </w:r>
+    </w:p>
+    <w:p xmlns:wp14="http://schemas.microsoft.com/office/word/2010/wordml" wp14:textId="77777777">
+      <w:pPr>
+        <w:spacing w:before="0" w:after="120"/>
+        <w:jc w:val="left"/>
+      </w:pPr>
+      <w:r>
+        <w:rPr>
+          <w:rFonts w:ascii="Arial" w:hAnsi="Arial" w:eastAsia="Arial" w:cs="Arial"/>
+          <w:color w:val="5C6B7A"/>
+          <w:sz w:val="19"/>
+          <w:szCs w:val="19"/>
+        </w:rPr>
+        <w:t>A partner-only note reaches your TSANet partner but stays hidden from the end customer. With the ZAF app, choose Partner only in the Add Note dialog. Without the app, use the TSANet Action field on the ticket:</w:t>
+      </w:r>
+    </w:p>
+    <w:p xmlns:wp14="http://schemas.microsoft.com/office/word/2010/wordml" wp14:textId="77777777">
+      <w:pPr>
+        <w:pStyle w:val="ListParagraph"/>
+        <w:numPr>
+          <w:ilvl w:val="0"/>
+          <w:numId w:val="4"/>
+        </w:numPr>
+        <w:spacing w:before="0" w:after="90"/>
+        <w:jc w:val="left"/>
+      </w:pPr>
+      <w:r>
+        <w:rPr>
+          <w:rFonts w:ascii="Arial" w:hAnsi="Arial" w:eastAsia="Arial" w:cs="Arial"/>
+          <w:color w:val="1A1A2E"/>
+          <w:sz w:val="19"/>
+          <w:szCs w:val="19"/>
+        </w:rPr>
+        <w:t>Type the note in the TSANet Action Text field.</w:t>
+      </w:r>
+    </w:p>
+    <w:p xmlns:wp14="http://schemas.microsoft.com/office/word/2010/wordml" wp14:textId="77777777">
+      <w:pPr>
+        <w:pStyle w:val="ListParagraph"/>
+        <w:numPr>
+          <w:ilvl w:val="0"/>
+          <w:numId w:val="4"/>
+        </w:numPr>
+        <w:spacing w:before="0" w:after="90"/>
+        <w:jc w:val="left"/>
+      </w:pPr>
+      <w:r>
+        <w:rPr>
+          <w:rFonts w:ascii="Arial" w:hAnsi="Arial" w:eastAsia="Arial" w:cs="Arial"/>
+          <w:color w:val="1A1A2E"/>
+          <w:sz w:val="19"/>
+          <w:szCs w:val="19"/>
+        </w:rPr>
+        <w:t>Set TSANet Action to Add Note, or apply the TSANet: Send partner-only note macro (your admin creates this macro once; it sets the dropdown for you).</w:t>
+      </w:r>
+    </w:p>
+    <w:p xmlns:wp14="http://schemas.microsoft.com/office/word/2010/wordml" wp14:textId="77777777">
+      <w:pPr>
+        <w:pStyle w:val="ListParagraph"/>
+        <w:numPr>
+          <w:ilvl w:val="0"/>
+          <w:numId w:val="4"/>
+        </w:numPr>
+        <w:spacing w:before="0" w:after="90"/>
+        <w:jc w:val="left"/>
+      </w:pPr>
+      <w:r>
+        <w:rPr>
+          <w:rFonts w:ascii="Arial" w:hAnsi="Arial" w:eastAsia="Arial" w:cs="Arial"/>
+          <w:color w:val="1A1A2E"/>
+          <w:sz w:val="19"/>
+          <w:szCs w:val="19"/>
+        </w:rPr>
+        <w:t>Submit the ticket.</w:t>
+      </w:r>
+    </w:p>
+    <w:p xmlns:wp14="http://schemas.microsoft.com/office/word/2010/wordml" wp14:textId="77777777">
+      <w:pPr>
+        <w:spacing w:before="60" w:after="200"/>
+        <w:jc w:val="left"/>
+      </w:pPr>
+      <w:r>
+        <w:rPr>
+          <w:rFonts w:ascii="Arial" w:hAnsi="Arial" w:eastAsia="Arial" w:cs="Arial"/>
+          <w:color w:val="5C6B7A"/>
+          <w:sz w:val="19"/>
+          <w:szCs w:val="19"/>
+        </w:rPr>
+        <w:t>The note goes to the partner only; the end customer never sees it, and an internal note is added to the ticket so you have a record. Important: Zendesk’s own reply box offers only Public reply and Internal note and cannot be changed, so a partner-only note must come from the TSANet Action field, the TSANet: Send partner-only note macro, or the ZAF app’s Add Note dialog, never the native reply box.</w:t>
       </w:r>
     </w:p>
     <w:p xmlns:wp14="http://schemas.microsoft.com/office/word/2010/wordml" wp14:textId="77777777">
@@ -26497,6 +26604,12 @@
     </w:lvlOverride>
   </w:num>
   <w:num w:numId="3">
+    <w:abstractNumId w:val="9"/>
+    <w:lvlOverride w:ilvl="0">
+      <w:startOverride w:val="1"/>
+    </w:lvlOverride>
+  </w:num>
+  <w:num w:numId="4">
     <w:abstractNumId w:val="9"/>
     <w:lvlOverride w:ilvl="0">
       <w:startOverride w:val="1"/>

</xml_diff>